<commit_message>
Exception handling in springboot
</commit_message>
<xml_diff>
--- a/Spring_boot_Interview.docx
+++ b/Spring_boot_Interview.docx
@@ -14,8 +14,17 @@
           <w:sz w:val="40"/>
           <w:szCs w:val="40"/>
         </w:rPr>
-        <w:t>1)what is SDLC ?</w:t>
-      </w:r>
+        <w:t xml:space="preserve">1)what is </w:t>
+      </w:r>
+      <w:proofErr w:type="gramStart"/>
+      <w:r>
+        <w:rPr>
+          <w:sz w:val="40"/>
+          <w:szCs w:val="40"/>
+        </w:rPr>
+        <w:t>SDLC ?</w:t>
+      </w:r>
+      <w:proofErr w:type="gramEnd"/>
     </w:p>
     <w:p>
       <w:pPr>
@@ -59,8 +68,26 @@
           <w:sz w:val="40"/>
           <w:szCs w:val="40"/>
         </w:rPr>
-        <w:t>4)What is IOC principle in SpringBoot ?</w:t>
-      </w:r>
+        <w:t xml:space="preserve">4)What is IOC principle in </w:t>
+      </w:r>
+      <w:proofErr w:type="spellStart"/>
+      <w:proofErr w:type="gramStart"/>
+      <w:r>
+        <w:rPr>
+          <w:sz w:val="40"/>
+          <w:szCs w:val="40"/>
+        </w:rPr>
+        <w:t>SpringBoot</w:t>
+      </w:r>
+      <w:proofErr w:type="spellEnd"/>
+      <w:r>
+        <w:rPr>
+          <w:sz w:val="40"/>
+          <w:szCs w:val="40"/>
+        </w:rPr>
+        <w:t xml:space="preserve"> ?</w:t>
+      </w:r>
+      <w:proofErr w:type="gramEnd"/>
     </w:p>
     <w:p>
       <w:pPr>
@@ -134,7 +161,39 @@
           <w:sz w:val="40"/>
           <w:szCs w:val="40"/>
         </w:rPr>
-        <w:t>9)BeanFactory vs ApplicationContext.</w:t>
+        <w:t>9)</w:t>
+      </w:r>
+      <w:proofErr w:type="spellStart"/>
+      <w:r>
+        <w:rPr>
+          <w:sz w:val="40"/>
+          <w:szCs w:val="40"/>
+        </w:rPr>
+        <w:t>BeanFactory</w:t>
+      </w:r>
+      <w:proofErr w:type="spellEnd"/>
+      <w:r>
+        <w:rPr>
+          <w:sz w:val="40"/>
+          <w:szCs w:val="40"/>
+        </w:rPr>
+        <w:t xml:space="preserve"> vs </w:t>
+      </w:r>
+      <w:proofErr w:type="spellStart"/>
+      <w:r>
+        <w:rPr>
+          <w:sz w:val="40"/>
+          <w:szCs w:val="40"/>
+        </w:rPr>
+        <w:t>ApplicationContext</w:t>
+      </w:r>
+      <w:proofErr w:type="spellEnd"/>
+      <w:r>
+        <w:rPr>
+          <w:sz w:val="40"/>
+          <w:szCs w:val="40"/>
+        </w:rPr>
+        <w:t>.</w:t>
       </w:r>
     </w:p>
     <w:p>
@@ -179,23 +238,41 @@
           <w:sz w:val="40"/>
           <w:szCs w:val="40"/>
         </w:rPr>
-        <w:t>12)what are annotations ?</w:t>
-      </w:r>
-    </w:p>
-    <w:p>
-      <w:pPr>
-        <w:rPr>
-          <w:sz w:val="40"/>
-          <w:szCs w:val="40"/>
-        </w:rPr>
-      </w:pPr>
-      <w:r>
-        <w:rPr>
-          <w:sz w:val="40"/>
-          <w:szCs w:val="40"/>
-        </w:rPr>
-        <w:t>13)what is POM.XML ?</w:t>
-      </w:r>
+        <w:t xml:space="preserve">12)what are </w:t>
+      </w:r>
+      <w:proofErr w:type="gramStart"/>
+      <w:r>
+        <w:rPr>
+          <w:sz w:val="40"/>
+          <w:szCs w:val="40"/>
+        </w:rPr>
+        <w:t>annotations ?</w:t>
+      </w:r>
+      <w:proofErr w:type="gramEnd"/>
+    </w:p>
+    <w:p>
+      <w:pPr>
+        <w:rPr>
+          <w:sz w:val="40"/>
+          <w:szCs w:val="40"/>
+        </w:rPr>
+      </w:pPr>
+      <w:r>
+        <w:rPr>
+          <w:sz w:val="40"/>
+          <w:szCs w:val="40"/>
+        </w:rPr>
+        <w:t xml:space="preserve">13)what is </w:t>
+      </w:r>
+      <w:proofErr w:type="gramStart"/>
+      <w:r>
+        <w:rPr>
+          <w:sz w:val="40"/>
+          <w:szCs w:val="40"/>
+        </w:rPr>
+        <w:t>POM.XML ?</w:t>
+      </w:r>
+      <w:proofErr w:type="gramEnd"/>
     </w:p>
     <w:p>
       <w:pPr>
@@ -285,8 +362,42 @@
           <w:szCs w:val="40"/>
         </w:rPr>
         <w:lastRenderedPageBreak/>
-        <w:t>19)Dispatcherservelet in Tomcat apache ?</w:t>
-      </w:r>
+        <w:t>19)</w:t>
+      </w:r>
+      <w:proofErr w:type="spellStart"/>
+      <w:r>
+        <w:rPr>
+          <w:sz w:val="40"/>
+          <w:szCs w:val="40"/>
+        </w:rPr>
+        <w:t>Dispatcherservelet</w:t>
+      </w:r>
+      <w:proofErr w:type="spellEnd"/>
+      <w:r>
+        <w:rPr>
+          <w:sz w:val="40"/>
+          <w:szCs w:val="40"/>
+        </w:rPr>
+        <w:t xml:space="preserve"> in Tomcat </w:t>
+      </w:r>
+      <w:proofErr w:type="spellStart"/>
+      <w:proofErr w:type="gramStart"/>
+      <w:r>
+        <w:rPr>
+          <w:sz w:val="40"/>
+          <w:szCs w:val="40"/>
+        </w:rPr>
+        <w:t>apache</w:t>
+      </w:r>
+      <w:proofErr w:type="spellEnd"/>
+      <w:r>
+        <w:rPr>
+          <w:sz w:val="40"/>
+          <w:szCs w:val="40"/>
+        </w:rPr>
+        <w:t xml:space="preserve"> ?</w:t>
+      </w:r>
+      <w:proofErr w:type="gramEnd"/>
     </w:p>
     <w:p>
       <w:pPr>
@@ -315,68 +426,138 @@
           <w:sz w:val="40"/>
           <w:szCs w:val="40"/>
         </w:rPr>
-        <w:t>21)what is Spring web ?</w:t>
-      </w:r>
-    </w:p>
-    <w:p>
-      <w:pPr>
-        <w:rPr>
-          <w:sz w:val="40"/>
-          <w:szCs w:val="40"/>
-        </w:rPr>
-      </w:pPr>
-      <w:r>
-        <w:rPr>
-          <w:sz w:val="40"/>
-          <w:szCs w:val="40"/>
-        </w:rPr>
-        <w:t>22)what is Devtools?</w:t>
-      </w:r>
-    </w:p>
-    <w:p>
-      <w:pPr>
-        <w:rPr>
-          <w:sz w:val="40"/>
-          <w:szCs w:val="40"/>
-        </w:rPr>
-      </w:pPr>
-      <w:r>
-        <w:rPr>
-          <w:sz w:val="40"/>
-          <w:szCs w:val="40"/>
-        </w:rPr>
-        <w:t>23)what is Lombook ?</w:t>
-      </w:r>
-    </w:p>
-    <w:p>
-      <w:pPr>
-        <w:rPr>
-          <w:sz w:val="40"/>
-          <w:szCs w:val="40"/>
-        </w:rPr>
-      </w:pPr>
-      <w:r>
-        <w:rPr>
-          <w:sz w:val="40"/>
-          <w:szCs w:val="40"/>
-        </w:rPr>
-        <w:t>24)what is Jackson library ?</w:t>
-      </w:r>
-    </w:p>
-    <w:p>
-      <w:pPr>
-        <w:rPr>
-          <w:sz w:val="40"/>
-          <w:szCs w:val="40"/>
-        </w:rPr>
-      </w:pPr>
-      <w:r>
-        <w:rPr>
-          <w:sz w:val="40"/>
-          <w:szCs w:val="40"/>
-        </w:rPr>
-        <w:t>25)what is representation in rest api ?</w:t>
-      </w:r>
+        <w:t xml:space="preserve">21)what is Spring </w:t>
+      </w:r>
+      <w:proofErr w:type="gramStart"/>
+      <w:r>
+        <w:rPr>
+          <w:sz w:val="40"/>
+          <w:szCs w:val="40"/>
+        </w:rPr>
+        <w:t>web ?</w:t>
+      </w:r>
+      <w:proofErr w:type="gramEnd"/>
+    </w:p>
+    <w:p>
+      <w:pPr>
+        <w:rPr>
+          <w:sz w:val="40"/>
+          <w:szCs w:val="40"/>
+        </w:rPr>
+      </w:pPr>
+      <w:r>
+        <w:rPr>
+          <w:sz w:val="40"/>
+          <w:szCs w:val="40"/>
+        </w:rPr>
+        <w:t xml:space="preserve">22)what is </w:t>
+      </w:r>
+      <w:proofErr w:type="spellStart"/>
+      <w:r>
+        <w:rPr>
+          <w:sz w:val="40"/>
+          <w:szCs w:val="40"/>
+        </w:rPr>
+        <w:t>Devtools</w:t>
+      </w:r>
+      <w:proofErr w:type="spellEnd"/>
+      <w:r>
+        <w:rPr>
+          <w:sz w:val="40"/>
+          <w:szCs w:val="40"/>
+        </w:rPr>
+        <w:t>?</w:t>
+      </w:r>
+    </w:p>
+    <w:p>
+      <w:pPr>
+        <w:rPr>
+          <w:sz w:val="40"/>
+          <w:szCs w:val="40"/>
+        </w:rPr>
+      </w:pPr>
+      <w:r>
+        <w:rPr>
+          <w:sz w:val="40"/>
+          <w:szCs w:val="40"/>
+        </w:rPr>
+        <w:t xml:space="preserve">23)what is </w:t>
+      </w:r>
+      <w:proofErr w:type="spellStart"/>
+      <w:proofErr w:type="gramStart"/>
+      <w:r>
+        <w:rPr>
+          <w:sz w:val="40"/>
+          <w:szCs w:val="40"/>
+        </w:rPr>
+        <w:t>Lombook</w:t>
+      </w:r>
+      <w:proofErr w:type="spellEnd"/>
+      <w:r>
+        <w:rPr>
+          <w:sz w:val="40"/>
+          <w:szCs w:val="40"/>
+        </w:rPr>
+        <w:t xml:space="preserve"> ?</w:t>
+      </w:r>
+      <w:proofErr w:type="gramEnd"/>
+    </w:p>
+    <w:p>
+      <w:pPr>
+        <w:rPr>
+          <w:sz w:val="40"/>
+          <w:szCs w:val="40"/>
+        </w:rPr>
+      </w:pPr>
+      <w:r>
+        <w:rPr>
+          <w:sz w:val="40"/>
+          <w:szCs w:val="40"/>
+        </w:rPr>
+        <w:t xml:space="preserve">24)what is Jackson </w:t>
+      </w:r>
+      <w:proofErr w:type="gramStart"/>
+      <w:r>
+        <w:rPr>
+          <w:sz w:val="40"/>
+          <w:szCs w:val="40"/>
+        </w:rPr>
+        <w:t>library ?</w:t>
+      </w:r>
+      <w:proofErr w:type="gramEnd"/>
+    </w:p>
+    <w:p>
+      <w:pPr>
+        <w:rPr>
+          <w:sz w:val="40"/>
+          <w:szCs w:val="40"/>
+        </w:rPr>
+      </w:pPr>
+      <w:r>
+        <w:rPr>
+          <w:sz w:val="40"/>
+          <w:szCs w:val="40"/>
+        </w:rPr>
+        <w:t xml:space="preserve">25)what is representation in rest </w:t>
+      </w:r>
+      <w:proofErr w:type="spellStart"/>
+      <w:proofErr w:type="gramStart"/>
+      <w:r>
+        <w:rPr>
+          <w:sz w:val="40"/>
+          <w:szCs w:val="40"/>
+        </w:rPr>
+        <w:t>api</w:t>
+      </w:r>
+      <w:proofErr w:type="spellEnd"/>
+      <w:r>
+        <w:rPr>
+          <w:sz w:val="40"/>
+          <w:szCs w:val="40"/>
+        </w:rPr>
+        <w:t xml:space="preserve"> ?</w:t>
+      </w:r>
+      <w:proofErr w:type="gramEnd"/>
     </w:p>
     <w:p>
       <w:pPr>
@@ -601,8 +782,33 @@
           <w:sz w:val="40"/>
           <w:szCs w:val="40"/>
         </w:rPr>
-        <w:t>34) what is ORM ? what’s hibernate ?</w:t>
-      </w:r>
+        <w:t xml:space="preserve">34) what is </w:t>
+      </w:r>
+      <w:proofErr w:type="gramStart"/>
+      <w:r>
+        <w:rPr>
+          <w:sz w:val="40"/>
+          <w:szCs w:val="40"/>
+        </w:rPr>
+        <w:t>ORM ?</w:t>
+      </w:r>
+      <w:proofErr w:type="gramEnd"/>
+      <w:r>
+        <w:rPr>
+          <w:sz w:val="40"/>
+          <w:szCs w:val="40"/>
+        </w:rPr>
+        <w:t xml:space="preserve"> what’s </w:t>
+      </w:r>
+      <w:proofErr w:type="gramStart"/>
+      <w:r>
+        <w:rPr>
+          <w:sz w:val="40"/>
+          <w:szCs w:val="40"/>
+        </w:rPr>
+        <w:t>hibernate ?</w:t>
+      </w:r>
+      <w:proofErr w:type="gramEnd"/>
     </w:p>
     <w:p>
       <w:pPr>
@@ -631,7 +837,23 @@
           <w:sz w:val="40"/>
           <w:szCs w:val="40"/>
         </w:rPr>
-        <w:t>36)JpaRepository?</w:t>
+        <w:t>36)</w:t>
+      </w:r>
+      <w:proofErr w:type="spellStart"/>
+      <w:r>
+        <w:rPr>
+          <w:sz w:val="40"/>
+          <w:szCs w:val="40"/>
+        </w:rPr>
+        <w:t>JpaRepository</w:t>
+      </w:r>
+      <w:proofErr w:type="spellEnd"/>
+      <w:r>
+        <w:rPr>
+          <w:sz w:val="40"/>
+          <w:szCs w:val="40"/>
+        </w:rPr>
+        <w:t>?</w:t>
       </w:r>
     </w:p>
     <w:p>
@@ -723,6 +945,217 @@
         </w:rPr>
         <w:t>42)JPQL vs Native Query.</w:t>
       </w:r>
+    </w:p>
+    <w:p>
+      <w:pPr>
+        <w:rPr>
+          <w:sz w:val="40"/>
+          <w:szCs w:val="40"/>
+        </w:rPr>
+      </w:pPr>
+      <w:r>
+        <w:rPr>
+          <w:sz w:val="40"/>
+          <w:szCs w:val="40"/>
+        </w:rPr>
+        <w:t>43)why you should use native query instead of JPQL?</w:t>
+      </w:r>
+    </w:p>
+    <w:p>
+      <w:pPr>
+        <w:rPr>
+          <w:sz w:val="40"/>
+          <w:szCs w:val="40"/>
+        </w:rPr>
+      </w:pPr>
+      <w:r>
+        <w:rPr>
+          <w:sz w:val="40"/>
+          <w:szCs w:val="40"/>
+        </w:rPr>
+        <w:t xml:space="preserve">44)how to handle the exceptions in the </w:t>
+      </w:r>
+      <w:proofErr w:type="spellStart"/>
+      <w:proofErr w:type="gramStart"/>
+      <w:r>
+        <w:rPr>
+          <w:sz w:val="40"/>
+          <w:szCs w:val="40"/>
+        </w:rPr>
+        <w:t>springBoot</w:t>
+      </w:r>
+      <w:proofErr w:type="spellEnd"/>
+      <w:r>
+        <w:rPr>
+          <w:sz w:val="40"/>
+          <w:szCs w:val="40"/>
+        </w:rPr>
+        <w:t xml:space="preserve"> ?</w:t>
+      </w:r>
+      <w:proofErr w:type="gramEnd"/>
+    </w:p>
+    <w:p>
+      <w:pPr>
+        <w:rPr>
+          <w:sz w:val="40"/>
+          <w:szCs w:val="40"/>
+        </w:rPr>
+      </w:pPr>
+      <w:r>
+        <w:rPr>
+          <w:sz w:val="40"/>
+          <w:szCs w:val="40"/>
+        </w:rPr>
+        <w:t>45)what is @</w:t>
+      </w:r>
+      <w:proofErr w:type="gramStart"/>
+      <w:r>
+        <w:rPr>
+          <w:sz w:val="40"/>
+          <w:szCs w:val="40"/>
+        </w:rPr>
+        <w:t>RestControllerAdvice ?</w:t>
+      </w:r>
+      <w:proofErr w:type="gramEnd"/>
+    </w:p>
+    <w:p>
+      <w:pPr>
+        <w:rPr>
+          <w:sz w:val="40"/>
+          <w:szCs w:val="40"/>
+        </w:rPr>
+      </w:pPr>
+      <w:r>
+        <w:rPr>
+          <w:sz w:val="40"/>
+          <w:szCs w:val="40"/>
+        </w:rPr>
+        <w:t xml:space="preserve">46)Local vs Global Exception handling in the </w:t>
+      </w:r>
+      <w:proofErr w:type="spellStart"/>
+      <w:proofErr w:type="gramStart"/>
+      <w:r>
+        <w:rPr>
+          <w:sz w:val="40"/>
+          <w:szCs w:val="40"/>
+        </w:rPr>
+        <w:t>Springboot</w:t>
+      </w:r>
+      <w:proofErr w:type="spellEnd"/>
+      <w:r>
+        <w:rPr>
+          <w:sz w:val="40"/>
+          <w:szCs w:val="40"/>
+        </w:rPr>
+        <w:t xml:space="preserve"> ?</w:t>
+      </w:r>
+      <w:proofErr w:type="gramEnd"/>
+    </w:p>
+    <w:p>
+      <w:pPr>
+        <w:rPr>
+          <w:sz w:val="40"/>
+          <w:szCs w:val="40"/>
+        </w:rPr>
+      </w:pPr>
+      <w:r>
+        <w:rPr>
+          <w:sz w:val="40"/>
+          <w:szCs w:val="40"/>
+        </w:rPr>
+        <w:t xml:space="preserve">47)What is </w:t>
+      </w:r>
+      <w:proofErr w:type="spellStart"/>
+      <w:proofErr w:type="gramStart"/>
+      <w:r>
+        <w:rPr>
+          <w:sz w:val="40"/>
+          <w:szCs w:val="40"/>
+        </w:rPr>
+        <w:t>ErrorResponse</w:t>
+      </w:r>
+      <w:proofErr w:type="spellEnd"/>
+      <w:r>
+        <w:rPr>
+          <w:sz w:val="40"/>
+          <w:szCs w:val="40"/>
+        </w:rPr>
+        <w:t xml:space="preserve"> ?</w:t>
+      </w:r>
+      <w:proofErr w:type="gramEnd"/>
+    </w:p>
+    <w:p>
+      <w:pPr>
+        <w:rPr>
+          <w:sz w:val="40"/>
+          <w:szCs w:val="40"/>
+        </w:rPr>
+      </w:pPr>
+      <w:r>
+        <w:rPr>
+          <w:sz w:val="40"/>
+          <w:szCs w:val="40"/>
+        </w:rPr>
+        <w:lastRenderedPageBreak/>
+        <w:t>48)@JoinColumn vs @</w:t>
+      </w:r>
+      <w:proofErr w:type="gramStart"/>
+      <w:r>
+        <w:rPr>
+          <w:sz w:val="40"/>
+          <w:szCs w:val="40"/>
+        </w:rPr>
+        <w:t>MappedBy ?</w:t>
+      </w:r>
+      <w:proofErr w:type="gramEnd"/>
+    </w:p>
+    <w:p>
+      <w:pPr>
+        <w:rPr>
+          <w:sz w:val="40"/>
+          <w:szCs w:val="40"/>
+        </w:rPr>
+      </w:pPr>
+      <w:r>
+        <w:rPr>
+          <w:sz w:val="40"/>
+          <w:szCs w:val="40"/>
+        </w:rPr>
+        <w:t>49)Cascade and it’s types?</w:t>
+      </w:r>
+    </w:p>
+    <w:p>
+      <w:pPr>
+        <w:rPr>
+          <w:sz w:val="40"/>
+          <w:szCs w:val="40"/>
+        </w:rPr>
+      </w:pPr>
+      <w:r>
+        <w:rPr>
+          <w:sz w:val="40"/>
+          <w:szCs w:val="40"/>
+        </w:rPr>
+        <w:t xml:space="preserve">50)what is </w:t>
+      </w:r>
+      <w:proofErr w:type="spellStart"/>
+      <w:proofErr w:type="gramStart"/>
+      <w:r>
+        <w:rPr>
+          <w:sz w:val="40"/>
+          <w:szCs w:val="40"/>
+        </w:rPr>
+        <w:t>Lombook</w:t>
+      </w:r>
+      <w:proofErr w:type="spellEnd"/>
+      <w:r>
+        <w:rPr>
+          <w:sz w:val="40"/>
+          <w:szCs w:val="40"/>
+        </w:rPr>
+        <w:t xml:space="preserve"> ?</w:t>
+      </w:r>
+      <w:proofErr w:type="gramEnd"/>
     </w:p>
     <w:sectPr>
       <w:pgSz w:w="12240" w:h="15840"/>

</xml_diff>